<commit_message>
Updated the evidences and the manual test steps
</commit_message>
<xml_diff>
--- a/evidence/TestReport.docx
+++ b/evidence/TestReport.docx
@@ -97,6 +97,23 @@
       <w:r>
         <w:t>Static SSR</w:t>
       </w:r>
+      <w:r>
+        <w:t xml:space="preserve"> (</w:t>
+      </w:r>
+      <w:r>
+        <w:t xml:space="preserve">Static SSR was the only supported configuration in scope; therefore, no configuration-specific differences were applicable or observed. No interactive Server, </w:t>
+      </w:r>
+      <w:proofErr w:type="spellStart"/>
+      <w:r>
+        <w:t>WebAssembly</w:t>
+      </w:r>
+      <w:proofErr w:type="spellEnd"/>
+      <w:r>
+        <w:t>, or Auto render mode was configured.</w:t>
+      </w:r>
+      <w:r>
+        <w:t>)</w:t>
+      </w:r>
     </w:p>
     <w:p>
       <w:pPr>
@@ -162,10 +179,11 @@
     </w:p>
     <w:p>
       <w:pPr>
-        <w:rPr>
-          <w:b/>
-          <w:bCs/>
-        </w:rPr>
+        <w:pStyle w:val="ListParagraph"/>
+        <w:numPr>
+          <w:ilvl w:val="0"/>
+          <w:numId w:val="2"/>
+        </w:numPr>
       </w:pPr>
       <w:r>
         <w:rPr>
@@ -175,11 +193,56 @@
         <w:t xml:space="preserve">Sample Location: </w:t>
       </w:r>
       <w:r>
+        <w:rPr>
+          <w:b/>
+          <w:bCs/>
+        </w:rPr>
         <w:br/>
       </w:r>
       <w:r>
+        <w:t xml:space="preserve">Repository - </w:t>
+      </w:r>
+      <w:hyperlink r:id="rId6" w:history="1">
+        <w:r>
+          <w:rPr>
+            <w:rStyle w:val="Hyperlink"/>
+          </w:rPr>
+          <w:t>https://github.com/Mo</w:t>
+        </w:r>
+        <w:r>
+          <w:rPr>
+            <w:rStyle w:val="Hyperlink"/>
+          </w:rPr>
+          <w:t>h</w:t>
+        </w:r>
+        <w:r>
+          <w:rPr>
+            <w:rStyle w:val="Hyperlink"/>
+          </w:rPr>
+          <w:t>amedHasan3644/tempdata-validation</w:t>
+        </w:r>
+      </w:hyperlink>
+      <w:r>
         <w:br/>
+        <w:t xml:space="preserve">Head Commit- </w:t>
       </w:r>
+      <w:r>
+        <w:t>c157c4c7222b443b3c8185bdddbf37bb7b12c62a</w:t>
+      </w:r>
+      <w:r>
+        <w:br/>
+        <w:t xml:space="preserve">Evidences- </w:t>
+      </w:r>
+      <w:hyperlink r:id="rId7" w:history="1">
+        <w:r>
+          <w:rPr>
+            <w:rStyle w:val="Hyperlink"/>
+          </w:rPr>
+          <w:t>https://github.com/MohamedHasan3644/tempdata-validation/tree/main/evidence</w:t>
+        </w:r>
+      </w:hyperlink>
+    </w:p>
+    <w:p>
       <w:r>
         <w:rPr>
           <w:b/>
@@ -516,6 +579,7 @@
                 <w:b/>
                 <w:bCs/>
               </w:rPr>
+              <w:lastRenderedPageBreak/>
               <w:t>Purpose:</w:t>
             </w:r>
             <w:r>
@@ -548,7 +612,6 @@
           </w:p>
           <w:p>
             <w:r>
-              <w:lastRenderedPageBreak/>
               <w:t>.</w:t>
             </w:r>
           </w:p>
@@ -572,11 +635,11 @@
               <w:t>PASS</w:t>
             </w:r>
             <w:r>
-              <w:t xml:space="preserve"> - POST / returned 302 Found and redirected to GET /read (200 OK). Both reads showed TC02-20260909-001 with markers true; </w:t>
+              <w:t xml:space="preserve"> - POST / returned 302 Found and </w:t>
             </w:r>
             <w:r>
               <w:lastRenderedPageBreak/>
-              <w:t>refresh showed both empty with markers false.</w:t>
+              <w:t>redirected to GET /read (200 OK). Both reads showed TC02-20260909-001 with markers true; refresh showed both empty with markers false.</w:t>
             </w:r>
           </w:p>
         </w:tc>
@@ -600,7 +663,11 @@
           <w:p>
             <w:r>
               <w:lastRenderedPageBreak/>
-              <w:t xml:space="preserve">The POST redirects to /read. Both reads in that first GET show the fresh value. After the response </w:t>
+              <w:t xml:space="preserve">The POST redirects to /read. Both reads in that first GET show </w:t>
+            </w:r>
+            <w:r>
+              <w:lastRenderedPageBreak/>
+              <w:t xml:space="preserve">the fresh value. After the response </w:t>
             </w:r>
             <w:proofErr w:type="gramStart"/>
             <w:r>
@@ -701,23 +768,7 @@
               <w:t>PASS</w:t>
             </w:r>
             <w:r>
-              <w:t xml:space="preserve"> - A new GET /read after navigating away returned both outputs empty. Browser Back made a server GET and returned empty; forced reload remained empty with a newer Request UTC. The </w:t>
-            </w:r>
-            <w:proofErr w:type="spellStart"/>
-            <w:r>
-              <w:t>VMxx</w:t>
-            </w:r>
-            <w:proofErr w:type="spellEnd"/>
-            <w:r>
-              <w:t xml:space="preserve"> </w:t>
-            </w:r>
-            <w:proofErr w:type="spellStart"/>
-            <w:r>
-              <w:t>startTime</w:t>
-            </w:r>
-            <w:proofErr w:type="spellEnd"/>
-            <w:r>
-              <w:t xml:space="preserve"> exception is classified below as tooling noise.</w:t>
+              <w:t xml:space="preserve"> - A new GET /read after navigating away returned both outputs empty. Browser Back made a server GET and returned empty; forced reload remained empty with a newer Request UTC.</w:t>
             </w:r>
           </w:p>
         </w:tc>
@@ -1162,23 +1213,7 @@
               <w:t>PASS</w:t>
             </w:r>
             <w:r>
-              <w:t xml:space="preserve"> - The keep-once page showed the stored value. The immediately following ordinary reader showed it in both reads; refresh showed both empty. The </w:t>
-            </w:r>
-            <w:proofErr w:type="spellStart"/>
-            <w:r>
-              <w:t>VMxx</w:t>
-            </w:r>
-            <w:proofErr w:type="spellEnd"/>
-            <w:r>
-              <w:t xml:space="preserve"> </w:t>
-            </w:r>
-            <w:proofErr w:type="spellStart"/>
-            <w:r>
-              <w:t>startTime</w:t>
-            </w:r>
-            <w:proofErr w:type="spellEnd"/>
-            <w:r>
-              <w:t xml:space="preserve"> exception is classified below as tooling noise.</w:t>
+              <w:t xml:space="preserve"> - The keep-once page showed the stored value. The immediately following ordinary reader showed it in both reads; refresh showed both empty.</w:t>
             </w:r>
           </w:p>
         </w:tc>
@@ -1302,27 +1337,7 @@
             </w:r>
             <w:proofErr w:type="spellEnd"/>
             <w:r>
-              <w:t xml:space="preserve"> error. The next ordinary reader showed it in both reads; </w:t>
-            </w:r>
-            <w:r>
-              <w:lastRenderedPageBreak/>
-              <w:t xml:space="preserve">refresh was empty. The </w:t>
-            </w:r>
-            <w:proofErr w:type="spellStart"/>
-            <w:r>
-              <w:t>VMxx</w:t>
-            </w:r>
-            <w:proofErr w:type="spellEnd"/>
-            <w:r>
-              <w:t xml:space="preserve"> </w:t>
-            </w:r>
-            <w:proofErr w:type="spellStart"/>
-            <w:r>
-              <w:t>startTime</w:t>
-            </w:r>
-            <w:proofErr w:type="spellEnd"/>
-            <w:r>
-              <w:t xml:space="preserve"> exception is classified below as tooling noise.</w:t>
+              <w:t xml:space="preserve"> error. The next ordinary reader showed it in both reads; refresh was empty.</w:t>
             </w:r>
           </w:p>
         </w:tc>
@@ -1345,7 +1360,6 @@
           </w:tcPr>
           <w:p>
             <w:r>
-              <w:lastRenderedPageBreak/>
               <w:t xml:space="preserve">Peek-then-keep shows the value without error. The ordinary reader sees it once; the ordinary </w:t>
             </w:r>
             <w:proofErr w:type="gramStart"/>
@@ -1379,6 +1393,7 @@
           </w:tcPr>
           <w:p>
             <w:r>
+              <w:lastRenderedPageBreak/>
               <w:t>TC-08</w:t>
             </w:r>
           </w:p>
@@ -1700,7 +1715,6 @@
                 <w:b/>
                 <w:bCs/>
               </w:rPr>
-              <w:lastRenderedPageBreak/>
               <w:t>Purpose:</w:t>
             </w:r>
             <w:r>
@@ -1740,59 +1754,38 @@
               <w:rPr>
                 <w:b/>
               </w:rPr>
+              <w:t>PASS</w:t>
+            </w:r>
+            <w:r>
+              <w:t xml:space="preserve"> - The cascading and bound-property readers both displayed the identical value message001 once. Both readers were empty after their </w:t>
+            </w:r>
+            <w:r>
               <w:lastRenderedPageBreak/>
-              <w:t>PASS</w:t>
-            </w:r>
-            <w:r>
-              <w:t xml:space="preserve"> - The cascading and bound-property </w:t>
-            </w:r>
+              <w:t>respective reloads.</w:t>
+            </w:r>
+          </w:p>
+        </w:tc>
+        <w:tc>
+          <w:tcPr>
+            <w:tcW w:w="2337" w:type="dxa"/>
+            <w:tcBorders>
+              <w:top w:val="single" w:sz="8" w:space="0" w:color="A3A3A3"/>
+              <w:left w:val="single" w:sz="8" w:space="0" w:color="A3A3A3"/>
+              <w:bottom w:val="single" w:sz="8" w:space="0" w:color="A3A3A3"/>
+              <w:right w:val="single" w:sz="8" w:space="0" w:color="A3A3A3"/>
+            </w:tcBorders>
+            <w:tcMar>
+              <w:top w:w="80" w:type="dxa"/>
+              <w:left w:w="80" w:type="dxa"/>
+              <w:bottom w:w="80" w:type="dxa"/>
+              <w:right w:w="80" w:type="dxa"/>
+            </w:tcMar>
+            <w:hideMark/>
+          </w:tcPr>
+          <w:p>
             <w:r>
               <w:lastRenderedPageBreak/>
-              <w:t xml:space="preserve">readers both displayed the identical value message001 once. Both readers were empty after their respective reloads. The </w:t>
-            </w:r>
-            <w:proofErr w:type="spellStart"/>
-            <w:r>
-              <w:t>VMxx</w:t>
-            </w:r>
-            <w:proofErr w:type="spellEnd"/>
-            <w:r>
-              <w:t xml:space="preserve"> </w:t>
-            </w:r>
-            <w:proofErr w:type="spellStart"/>
-            <w:r>
-              <w:t>startTime</w:t>
-            </w:r>
-            <w:proofErr w:type="spellEnd"/>
-            <w:r>
-              <w:t xml:space="preserve"> exception is classified below as tooling noise.</w:t>
-            </w:r>
-          </w:p>
-        </w:tc>
-        <w:tc>
-          <w:tcPr>
-            <w:tcW w:w="2337" w:type="dxa"/>
-            <w:tcBorders>
-              <w:top w:val="single" w:sz="8" w:space="0" w:color="A3A3A3"/>
-              <w:left w:val="single" w:sz="8" w:space="0" w:color="A3A3A3"/>
-              <w:bottom w:val="single" w:sz="8" w:space="0" w:color="A3A3A3"/>
-              <w:right w:val="single" w:sz="8" w:space="0" w:color="A3A3A3"/>
-            </w:tcBorders>
-            <w:tcMar>
-              <w:top w:w="80" w:type="dxa"/>
-              <w:left w:w="80" w:type="dxa"/>
-              <w:bottom w:w="80" w:type="dxa"/>
-              <w:right w:w="80" w:type="dxa"/>
-            </w:tcMar>
-            <w:hideMark/>
-          </w:tcPr>
-          <w:p>
-            <w:r>
-              <w:lastRenderedPageBreak/>
-              <w:t xml:space="preserve">Both readers display the identical string once and are empty </w:t>
-            </w:r>
-            <w:r>
-              <w:lastRenderedPageBreak/>
-              <w:t>after their respective reloads.</w:t>
+              <w:t>Both readers display the identical string once and are empty after their respective reloads.</w:t>
             </w:r>
           </w:p>
         </w:tc>
@@ -2042,27 +2035,7 @@
               <w:t>PASS</w:t>
             </w:r>
             <w:r>
-              <w:t xml:space="preserve"> - POST /same-request returned 200 OK without redirecting. Both reads returned same-request-001 with markers true; the following GET /read </w:t>
-            </w:r>
-            <w:r>
-              <w:lastRenderedPageBreak/>
-              <w:t xml:space="preserve">returned both outputs empty with markers false. The </w:t>
-            </w:r>
-            <w:proofErr w:type="spellStart"/>
-            <w:r>
-              <w:t>VMxx</w:t>
-            </w:r>
-            <w:proofErr w:type="spellEnd"/>
-            <w:r>
-              <w:t xml:space="preserve"> </w:t>
-            </w:r>
-            <w:proofErr w:type="spellStart"/>
-            <w:r>
-              <w:t>startTime</w:t>
-            </w:r>
-            <w:proofErr w:type="spellEnd"/>
-            <w:r>
-              <w:t xml:space="preserve"> exception is classified below as tooling noise.</w:t>
+              <w:t xml:space="preserve"> - POST /same-request returned 200 OK without redirecting. Both reads returned same-request-001 with markers true; the following GET /read returned both outputs empty with markers false.</w:t>
             </w:r>
           </w:p>
         </w:tc>
@@ -2085,7 +2058,6 @@
           </w:tcPr>
           <w:p>
             <w:r>
-              <w:lastRenderedPageBreak/>
               <w:t>The POST response remains on /</w:t>
             </w:r>
             <w:proofErr w:type="gramStart"/>
@@ -2261,6 +2233,7 @@
           </w:tcPr>
           <w:p>
             <w:r>
+              <w:lastRenderedPageBreak/>
               <w:t>Navigate away and come back</w:t>
             </w:r>
           </w:p>
@@ -2701,7 +2674,6 @@
           </w:tcPr>
           <w:p>
             <w:r>
-              <w:lastRenderedPageBreak/>
               <w:t>Write and read in one request</w:t>
             </w:r>
           </w:p>
@@ -2971,83 +2943,12 @@
         </w:tc>
       </w:tr>
     </w:tbl>
-    <w:p/>
-    <w:p>
-      <w:pPr>
-        <w:pStyle w:val="Heading1"/>
-      </w:pPr>
-      <w:r>
-        <w:t>Console tooling error classification</w:t>
-      </w:r>
-    </w:p>
     <w:p>
       <w:r>
-        <w:t>Observed in evidence: TC-03, TC-06, TC-07, TC-10, and TC-12.</w:t>
+        <w:br/>
       </w:r>
-    </w:p>
-    <w:p>
       <w:r>
-        <w:t>Classification: Non-product test-tooling noise; consistent with dynamically injected Web Vitals/performance instrumentation.</w:t>
-      </w:r>
-    </w:p>
-    <w:p>
-      <w:r>
-        <w:t xml:space="preserve">Observed error: Uncaught </w:t>
-      </w:r>
-      <w:proofErr w:type="spellStart"/>
-      <w:r>
-        <w:t>TypeError</w:t>
-      </w:r>
-      <w:proofErr w:type="spellEnd"/>
-      <w:r>
-        <w:t>: Cannot read properties of undefined (reading '</w:t>
-      </w:r>
-      <w:proofErr w:type="spellStart"/>
-      <w:r>
-        <w:t>startTime</w:t>
-      </w:r>
-      <w:proofErr w:type="spellEnd"/>
-      <w:r>
-        <w:t xml:space="preserve">') at </w:t>
-      </w:r>
-      <w:proofErr w:type="spellStart"/>
-      <w:proofErr w:type="gramStart"/>
-      <w:r>
-        <w:t>et.reportAllChanges</w:t>
-      </w:r>
-      <w:proofErr w:type="spellEnd"/>
-      <w:proofErr w:type="gramEnd"/>
-      <w:r>
-        <w:t xml:space="preserve"> (&lt;anonymous&gt;:2:19429), with source links such as VM86 and VM88.</w:t>
-      </w:r>
-    </w:p>
-    <w:p>
-      <w:r>
-        <w:t xml:space="preserve">Basis: The stack is attributed to </w:t>
-      </w:r>
-      <w:proofErr w:type="spellStart"/>
-      <w:r>
-        <w:t>VMxx</w:t>
-      </w:r>
-      <w:proofErr w:type="spellEnd"/>
-      <w:r>
-        <w:t xml:space="preserve">/&lt;anonymous&gt; dynamically evaluated code rather than an application asset. The identifiers </w:t>
-      </w:r>
-      <w:proofErr w:type="spellStart"/>
-      <w:r>
-        <w:t>reportAllChanges</w:t>
-      </w:r>
-      <w:proofErr w:type="spellEnd"/>
-      <w:r>
-        <w:t xml:space="preserve"> and </w:t>
-      </w:r>
-      <w:proofErr w:type="spellStart"/>
-      <w:r>
-        <w:t>startTime</w:t>
-      </w:r>
-      <w:proofErr w:type="spellEnd"/>
-      <w:r>
-        <w:t xml:space="preserve"> are absent from the sample source and generated static assets, and the same identifiers are associated with browser performance/Web Vitals instrumentation. All affected application document requests completed successfully with HTTP 200 and produced the expected </w:t>
+        <w:t xml:space="preserve">Unidentified browser-injected script error; no observed application impact. All relevant document requests returned the expected HTTP status and </w:t>
       </w:r>
       <w:proofErr w:type="spellStart"/>
       <w:r>
@@ -3055,23 +2956,7 @@
       </w:r>
       <w:proofErr w:type="spellEnd"/>
       <w:r>
-        <w:t xml:space="preserve"> states. The error appeared only in selected evidence runs and did not alter application behavior.</w:t>
-      </w:r>
-    </w:p>
-    <w:p>
-      <w:r>
-        <w:t xml:space="preserve">Impact: Evidence-capture noise only. No </w:t>
-      </w:r>
-      <w:proofErr w:type="spellStart"/>
-      <w:r>
-        <w:t>TempData</w:t>
-      </w:r>
-      <w:proofErr w:type="spellEnd"/>
-      <w:r>
-        <w:t>, Blazor, binding, serialization, navigation, or server failure was observed. TC-03, TC-06, TC-07, TC-10, and TC-12 remain PASS</w:t>
-      </w:r>
-      <w:r>
-        <w:t>.</w:t>
+        <w:t xml:space="preserve"> state.</w:t>
       </w:r>
     </w:p>
     <w:sectPr>
@@ -3536,7 +3421,7 @@
   <w:abstractNum w:abstractNumId="3" w15:restartNumberingAfterBreak="0">
     <w:nsid w:val="27D96F2C"/>
     <w:multiLevelType w:val="hybridMultilevel"/>
-    <w:tmpl w:val="55202D5E"/>
+    <w:tmpl w:val="957AE15E"/>
     <w:lvl w:ilvl="0" w:tplc="04090001">
       <w:start w:val="1"/>
       <w:numFmt w:val="bullet"/>
@@ -4506,27 +4391,9 @@
   </w:abstractNum>
   <w:num w:numId="1" w16cid:durableId="1428578190">
     <w:abstractNumId w:val="4"/>
-    <w:lvlOverride w:ilvl="0"/>
-    <w:lvlOverride w:ilvl="1"/>
-    <w:lvlOverride w:ilvl="2"/>
-    <w:lvlOverride w:ilvl="3"/>
-    <w:lvlOverride w:ilvl="4"/>
-    <w:lvlOverride w:ilvl="5"/>
-    <w:lvlOverride w:ilvl="6"/>
-    <w:lvlOverride w:ilvl="7"/>
-    <w:lvlOverride w:ilvl="8"/>
   </w:num>
   <w:num w:numId="2" w16cid:durableId="1720326422">
     <w:abstractNumId w:val="3"/>
-    <w:lvlOverride w:ilvl="0"/>
-    <w:lvlOverride w:ilvl="1"/>
-    <w:lvlOverride w:ilvl="2"/>
-    <w:lvlOverride w:ilvl="3"/>
-    <w:lvlOverride w:ilvl="4"/>
-    <w:lvlOverride w:ilvl="5"/>
-    <w:lvlOverride w:ilvl="6"/>
-    <w:lvlOverride w:ilvl="7"/>
-    <w:lvlOverride w:ilvl="8"/>
   </w:num>
   <w:num w:numId="3" w16cid:durableId="1993485502">
     <w:abstractNumId w:val="9"/>
@@ -5494,6 +5361,18 @@
       <w:shd w:val="clear" w:color="auto" w:fill="E1DFDD"/>
     </w:rPr>
   </w:style>
+  <w:style w:type="character" w:styleId="FollowedHyperlink">
+    <w:name w:val="FollowedHyperlink"/>
+    <w:basedOn w:val="DefaultParagraphFont"/>
+    <w:uiPriority w:val="99"/>
+    <w:semiHidden/>
+    <w:unhideWhenUsed/>
+    <w:rsid w:val="006A1E23"/>
+    <w:rPr>
+      <w:color w:val="96607D" w:themeColor="followedHyperlink"/>
+      <w:u w:val="single"/>
+    </w:rPr>
+  </w:style>
 </w:styles>
 </file>
 

</xml_diff>